<commit_message>
Ajusta proposta de cortes: divisão real de tarefas, data sugerida e valor de R$1.500/mês
- Corrige quem confirma a data de gravação com os convidados (é o
  Giuliano, não a Amanda) e acrescenta a sugestão de data (12/11).
- Corrige a divisão de tarefas: o bônus de 5 cortes da ProHub não é
  usado — hoje é o René (via empresa do Alexandre) quem faz todos os
  cortes e o upload para YouTube/Spotify, com atraso de mais de 30
  dias. Se a Amanda assumir, ela cuida do upload e dos cortes; a
  ProHub segue só com gravação e edição bruta.
- Atualiza o valor sugerido de R$1.000 para R$1.500/mês, com
  cronograma estendido cobrindo os meses sem episódio novo (cortes
  de live ou edição de material extra).
- Remove a observação sobre não saber o valor cobrado pelo René.

Co-Authored-By: Claude Sonnet 5 <noreply@anthropic.com>
Claude-Session: https://claude.ai/code/session_01GQSqEjEuqv44iBdACeUWUZ
</commit_message>
<xml_diff>
--- a/eleva/proposta-cortes-elevacast-prohub.docx
+++ b/eleva/proposta-cortes-elevacast-prohub.docx
@@ -146,7 +146,7 @@
           <w:sz w:val="21"/>
           <w:szCs w:val="21"/>
         </w:rPr>
-        <w:t xml:space="preserve">A entrega inclui, por episódio, um bônus de </w:t>
+        <w:t xml:space="preserve">A ficha técnica da ProHub lista um bônus de 5 cortes verticais editados por episódio, mas esse bônus não está sendo usado — quem sempre cuidou de </w:t>
       </w:r>
       <w:r>
         <w:rPr>
@@ -155,14 +155,14 @@
           <w:sz w:val="21"/>
           <w:szCs w:val="21"/>
         </w:rPr>
-        <w:t xml:space="preserve">5 cortes verticais editados</w:t>
-      </w:r>
-      <w:r>
-        <w:rPr>
-          <w:sz w:val="21"/>
-          <w:szCs w:val="21"/>
-        </w:rPr>
-        <w:t xml:space="preserve"> para redes sociais — mas quem vinha cuidando dos cortes adicionais (cortar o episódio inteiro em pequenos vídeos para alimentar o feed, até 20 ou 30 por episódio) era a empresa do René, que está entregando com muito atraso. É esse ponto que precisa de uma decisão agora.</w:t>
+        <w:t xml:space="preserve">todos</w:t>
+      </w:r>
+      <w:r>
+        <w:rPr>
+          <w:sz w:val="21"/>
+          <w:szCs w:val="21"/>
+        </w:rPr>
+        <w:t xml:space="preserve"> os cortes (e também do upload do episódio completo no YouTube e no Spotify) é a empresa do René, que atende a Eleva através do Alexandre (primo do Giuliano). O problema: o René está entregando com muito atraso — mais de 30 dias, enquanto a ProHub entrega em até 15. É esse ponto que precisa de uma decisão agora.</w:t>
       </w:r>
     </w:p>
     <w:p>
@@ -192,7 +192,7 @@
           <w:sz w:val="21"/>
           <w:szCs w:val="21"/>
         </w:rPr>
-        <w:t xml:space="preserve">A ProHub reservou as seguintes opções para a próxima edição (2 episódios, "Lado C #2"):</w:t>
+        <w:t xml:space="preserve">A ProHub reservou as seguintes opções, para a primeira quinzena de novembro (2 episódios, "Lado C #2"):</w:t>
       </w:r>
     </w:p>
     <w:p>
@@ -303,12 +303,40 @@
       </w:pPr>
       <w:r>
         <w:rPr>
-          <w:i/>
-          <w:iCs/>
-          <w:sz w:val="21"/>
-          <w:szCs w:val="21"/>
-        </w:rPr>
-        <w:t xml:space="preserve">As reservas ficam seguras enquanto a Amanda confirma com os convidados — avisar a ProHub se alguma não fizer mais sentido.</w:t>
+          <w:b/>
+          <w:bCs/>
+          <w:sz w:val="21"/>
+          <w:szCs w:val="21"/>
+        </w:rPr>
+        <w:t xml:space="preserve">Quem confirma a data com os convidados é o Giuliano, não a Amanda</w:t>
+      </w:r>
+      <w:r>
+        <w:rPr>
+          <w:sz w:val="21"/>
+          <w:szCs w:val="21"/>
+        </w:rPr>
+        <w:t xml:space="preserve"> — por isso a decisão precisa ser rápida, para ele já poder chamar os convidados a tempo. A Amanda dá retorno à Ingrid (comercial da ProHub) com a data escolhida até a semana que vem.</w:t>
+      </w:r>
+    </w:p>
+    <w:p>
+      <w:pPr>
+        <w:spacing w:after="160"/>
+      </w:pPr>
+      <w:r>
+        <w:rPr>
+          <w:b/>
+          <w:bCs/>
+          <w:sz w:val="21"/>
+          <w:szCs w:val="21"/>
+        </w:rPr>
+        <w:t xml:space="preserve">Sugestão da Amanda: dia 12 de novembro.</w:t>
+      </w:r>
+      <w:r>
+        <w:rPr>
+          <w:sz w:val="21"/>
+          <w:szCs w:val="21"/>
+        </w:rPr>
+        <w:t xml:space="preserve"> Dá cerca de um mês de folga a partir de hoje, tempo suficiente para o Giuliano organizar os convites.</w:t>
       </w:r>
     </w:p>
     <w:p>
@@ -523,7 +551,23 @@
           <w:sz w:val="21"/>
           <w:szCs w:val="21"/>
         </w:rPr>
-        <w:t xml:space="preserve">Inclui: gravação de até 60 min por episódio + 30 min extras de estúdio, edição posterior simples, bônus de 5 cortes verticais editados por episódio, operação técnica especializada, e upload no YouTube e Spotify. Identidade (logotipo, vinheta, GC, thumbnail) entregue junto da primeira edição.</w:t>
+        <w:t xml:space="preserve">Inclui: gravação de até 60 min por episódio + 30 min extras de estúdio, edição posterior simples, operação técnica especializada. Identidade (logotipo, vinheta, GC, thumbnail) entregue junto da primeira edição. </w:t>
+      </w:r>
+      <w:r>
+        <w:rPr>
+          <w:b/>
+          <w:bCs/>
+          <w:sz w:val="21"/>
+          <w:szCs w:val="21"/>
+        </w:rPr>
+        <w:t xml:space="preserve">Na prática, hoje:</w:t>
+      </w:r>
+      <w:r>
+        <w:rPr>
+          <w:sz w:val="21"/>
+          <w:szCs w:val="21"/>
+        </w:rPr>
+        <w:t xml:space="preserve"> a ProHub cuida só da gravação e da entrega do episódio editado bruto — o upload no YouTube/Spotify e todos os cortes ficam por conta do René.</w:t>
       </w:r>
     </w:p>
     <w:p>
@@ -764,70 +808,7 @@
           <w:sz w:val="21"/>
           <w:szCs w:val="21"/>
         </w:rPr>
-        <w:t xml:space="preserve">Em vez de pagar à ProHub o valor acima por cortes avulsos, a Amanda assume essa frente dentro do contrato mensal com a RECRIA, entregando os cortes de um episódio por mês (intercalando: cortes do episódio 1 num mês, cortes do episódio 2 no mês seguinte).</w:t>
-      </w:r>
-    </w:p>
-    <w:p>
-      <w:pPr>
-        <w:spacing w:after="160"/>
-      </w:pPr>
-      <w:r>
-        <w:rPr>
-          <w:b/>
-          <w:bCs/>
-          <w:sz w:val="21"/>
-          <w:szCs w:val="21"/>
-        </w:rPr>
-        <w:t xml:space="preserve">Acréscimo mensal sugerido: R$ 1.000,00/mês</w:t>
-      </w:r>
-      <w:r>
-        <w:rPr>
-          <w:sz w:val="21"/>
-          <w:szCs w:val="21"/>
-        </w:rPr>
-        <w:t xml:space="preserve"> (equivalente a ~R$ 250/semana).</w:t>
-      </w:r>
-    </w:p>
-    <w:p>
-      <w:pPr>
-        <w:spacing w:after="160"/>
-      </w:pPr>
-      <w:r>
-        <w:rPr>
-          <w:sz w:val="21"/>
-          <w:szCs w:val="21"/>
-        </w:rPr>
-        <w:t xml:space="preserve">Para efeito de comparação: pela ProHub, cortar </w:t>
-      </w:r>
-      <w:r>
-        <w:rPr>
-          <w:b/>
-          <w:bCs/>
-          <w:sz w:val="21"/>
-          <w:szCs w:val="21"/>
-        </w:rPr>
-        <w:t xml:space="preserve">um único episódio</w:t>
-      </w:r>
-      <w:r>
-        <w:rPr>
-          <w:sz w:val="21"/>
-          <w:szCs w:val="21"/>
-        </w:rPr>
-        <w:t xml:space="preserve"> em até 30 partes custaria R$ 2.400,00 avulso — ou seja, R$ 1.200,00 por episódio em média, considerando os dois episódios de uma sessão. Mesmo em R$ 1.000,00/mês, a Amanda ainda sai bem abaixo do valor da ProHub, com a vantagem de já estar dentro do relacionamento contínuo com a RECRIA, sem negociação avulsa a cada episódio — e o valor cobre de forma justa o volume real de trabalho (editar um episódio de mais de uma hora em até 30 cortes pequenos, mês a mês).</w:t>
-      </w:r>
-    </w:p>
-    <w:p>
-      <w:pPr>
-        <w:spacing w:after="160"/>
-      </w:pPr>
-      <w:r>
-        <w:rPr>
-          <w:i/>
-          <w:iCs/>
-          <w:sz w:val="21"/>
-          <w:szCs w:val="21"/>
-        </w:rPr>
-        <w:t xml:space="preserve">Ainda não se sabe quanto a empresa do René cobrava por esse mesmo serviço — vale perguntar ao Giuliano, até para servir de referência na negociação.</w:t>
+        <w:t xml:space="preserve">Em vez de pagar à ProHub o valor da seção 4, a Amanda assume essa frente dentro do contrato mensal com a RECRIA: sobe o episódio completo no YouTube e faz os cortes (até 30 por episódio), entregando um episódio por mês. A ProHub continua fazendo só o que já faz hoje — gravação e entrega do episódio editado bruto.</w:t>
       </w:r>
     </w:p>
     <w:p>
@@ -842,6 +823,49 @@
           <w:sz w:val="18"/>
           <w:szCs w:val="18"/>
         </w:rPr>
+        <w:t xml:space="preserve">Acréscimo mensal sugerido: R$ 1.500,00/mês.</w:t>
+      </w:r>
+    </w:p>
+    <w:p>
+      <w:pPr>
+        <w:spacing w:after="160"/>
+      </w:pPr>
+      <w:r>
+        <w:rPr>
+          <w:sz w:val="21"/>
+          <w:szCs w:val="21"/>
+        </w:rPr>
+        <w:t xml:space="preserve">Para efeito de comparação: pela ProHub, cortar </w:t>
+      </w:r>
+      <w:r>
+        <w:rPr>
+          <w:b/>
+          <w:bCs/>
+          <w:sz w:val="21"/>
+          <w:szCs w:val="21"/>
+        </w:rPr>
+        <w:t xml:space="preserve">um único episódio</w:t>
+      </w:r>
+      <w:r>
+        <w:rPr>
+          <w:sz w:val="21"/>
+          <w:szCs w:val="21"/>
+        </w:rPr>
+        <w:t xml:space="preserve"> em até 30 partes custaria R$ 2.400,00 avulso. Pelo valor mensal da Amanda, mesmo nos meses em que ela entrega os cortes de um episódio, o Giuliano já sai com um desconto de quase R$ 900,00 em relação ao que a ProHub cobraria pelo mesmo volume — e nos meses sem episódio novo, o valor mensal continua cobrindo outro tipo de material (ver cronograma abaixo), em vez de ficar parado.</w:t>
+      </w:r>
+    </w:p>
+    <w:p>
+      <w:pPr>
+        <w:spacing w:after="80"/>
+      </w:pPr>
+      <w:r>
+        <w:rPr>
+          <w:i/>
+          <w:iCs/>
+          <w:color w:val="555555"/>
+          <w:sz w:val="18"/>
+          <w:szCs w:val="18"/>
+        </w:rPr>
         <w:t xml:space="preserve">Cronograma, se a Amanda assumir:</w:t>
       </w:r>
     </w:p>
@@ -910,7 +934,24 @@
           <w:sz w:val="21"/>
           <w:szCs w:val="21"/>
         </w:rPr>
-        <w:t xml:space="preserve">Segue nesse ritmo intercalado a cada nova gravação.</w:t>
+        <w:t xml:space="preserve">Janeiro e fevereiro (meses sem episódio novo de podcast): Amanda usa o mesmo valor mensal para cortar as lives, ou editar outros materiais — vídeos extras que o Giuliano gravar em casa, por exemplo, ou apoiar na captação desses vídeos.</w:t>
+      </w:r>
+    </w:p>
+    <w:p>
+      <w:pPr>
+        <w:pStyle w:val="ListParagraph"/>
+        <w:numPr>
+          <w:ilvl w:val="0"/>
+          <w:numId w:val="1"/>
+        </w:numPr>
+        <w:spacing w:after="80"/>
+      </w:pPr>
+      <w:r>
+        <w:rPr>
+          <w:sz w:val="21"/>
+          <w:szCs w:val="21"/>
+        </w:rPr>
+        <w:t xml:space="preserve">Março: volta o ciclo com a próxima gravação de episódios.</w:t>
       </w:r>
     </w:p>
     <w:p>
@@ -994,7 +1035,7 @@
           <w:sz w:val="21"/>
           <w:szCs w:val="21"/>
         </w:rPr>
-        <w:t xml:space="preserve">, com acréscimo mensal de R$ 1.000,00 no contrato da RECRIA.</w:t>
+        <w:t xml:space="preserve">, com acréscimo mensal de R$ 1.500,00 no contrato da RECRIA.</w:t>
       </w:r>
     </w:p>
     <w:sectPr>

</xml_diff>

<commit_message>
Ajusta texto sobre entrega da ProHub e upload do René
Co-Authored-By: Claude Sonnet 5 <noreply@anthropic.com>
Claude-Session: https://claude.ai/code/session_01GQSqEjEuqv44iBdACeUWUZ
</commit_message>
<xml_diff>
--- a/eleva/proposta-cortes-elevacast-prohub.docx
+++ b/eleva/proposta-cortes-elevacast-prohub.docx
@@ -551,7 +551,7 @@
           <w:sz w:val="21"/>
           <w:szCs w:val="21"/>
         </w:rPr>
-        <w:t xml:space="preserve">Inclui: gravação de até 60 min por episódio + 30 min extras de estúdio, edição posterior simples, operação técnica especializada. Identidade (logotipo, vinheta, GC, thumbnail) entregue junto da primeira edição. </w:t>
+        <w:t xml:space="preserve">Inclui: gravação de até 60 min por episódio + 30 min extras de estúdio, edição posterior simples, operação técnica especializada. </w:t>
       </w:r>
       <w:r>
         <w:rPr>
@@ -567,7 +567,7 @@
           <w:sz w:val="21"/>
           <w:szCs w:val="21"/>
         </w:rPr>
-        <w:t xml:space="preserve"> a ProHub cuida só da gravação e da entrega do episódio editado bruto — o upload no YouTube/Spotify e todos os cortes ficam por conta do René.</w:t>
+        <w:t xml:space="preserve"> a ProHub cuida só da gravação e da entrega do episódio bruto editado e sem cortes — o upload no YouTube e todos os cortes ficam por conta do René.</w:t>
       </w:r>
     </w:p>
     <w:p>

</xml_diff>

<commit_message>
Acrescenta valor total do contrato e tabela comparativa ProHub x Recria
Co-Authored-By: Claude Sonnet 5 <noreply@anthropic.com>
Claude-Session: https://claude.ai/code/session_01GQSqEjEuqv44iBdACeUWUZ
</commit_message>
<xml_diff>
--- a/eleva/proposta-cortes-elevacast-prohub.docx
+++ b/eleva/proposta-cortes-elevacast-prohub.docx
@@ -835,23 +835,314 @@
           <w:sz w:val="21"/>
           <w:szCs w:val="21"/>
         </w:rPr>
-        <w:t xml:space="preserve">Para efeito de comparação: pela ProHub, cortar </w:t>
-      </w:r>
-      <w:r>
-        <w:rPr>
-          <w:b/>
-          <w:bCs/>
-          <w:sz w:val="21"/>
-          <w:szCs w:val="21"/>
-        </w:rPr>
-        <w:t xml:space="preserve">um único episódio</w:t>
-      </w:r>
-      <w:r>
-        <w:rPr>
-          <w:sz w:val="21"/>
-          <w:szCs w:val="21"/>
-        </w:rPr>
-        <w:t xml:space="preserve"> em até 30 partes custaria R$ 2.400,00 avulso. Pelo valor mensal da Amanda, mesmo nos meses em que ela entrega os cortes de um episódio, o Giuliano já sai com um desconto de quase R$ 900,00 em relação ao que a ProHub cobraria pelo mesmo volume — e nos meses sem episódio novo, o valor mensal continua cobrindo outro tipo de material (ver cronograma abaixo), em vez de ficar parado.</w:t>
+        <w:t xml:space="preserve">Ou seja, o contrato passa de R$ 2.000/mês para R$ 3.500/mês com a Recria, para ter os cortes quando tiver episódio novo, e cortes posteriores de lives e outros materiais da Eleva nos meses sem episódio.</w:t>
+      </w:r>
+    </w:p>
+    <w:p>
+      <w:pPr>
+        <w:spacing w:after="80"/>
+      </w:pPr>
+      <w:r>
+        <w:rPr>
+          <w:i/>
+          <w:iCs/>
+          <w:color w:val="555555"/>
+          <w:sz w:val="18"/>
+          <w:szCs w:val="18"/>
+        </w:rPr>
+        <w:t xml:space="preserve">Comparativo:</w:t>
+      </w:r>
+    </w:p>
+    <w:tbl>
+      <w:tblPr>
+        <w:tblW w:type="dxa" w:w="9026"/>
+        <w:tblBorders>
+          <w:top w:val="single" w:color="auto" w:sz="4"/>
+          <w:left w:val="single" w:color="auto" w:sz="4"/>
+          <w:bottom w:val="single" w:color="auto" w:sz="4"/>
+          <w:right w:val="single" w:color="auto" w:sz="4"/>
+          <w:insideH w:val="single" w:color="auto" w:sz="4"/>
+          <w:insideV w:val="single" w:color="auto" w:sz="4"/>
+        </w:tblBorders>
+      </w:tblPr>
+      <w:tblGrid>
+        <w:gridCol w:w="3008"/>
+        <w:gridCol w:w="3008"/>
+        <w:gridCol w:w="3008"/>
+      </w:tblGrid>
+      <w:tr>
+        <w:tc>
+          <w:tcPr>
+            <w:tcW w:type="dxa" w:w="3008"/>
+            <w:shd w:fill="1c2b4a" w:val="clear"/>
+          </w:tcPr>
+          <w:p/>
+        </w:tc>
+        <w:tc>
+          <w:tcPr>
+            <w:tcW w:type="dxa" w:w="3008"/>
+            <w:shd w:fill="1c2b4a" w:val="clear"/>
+          </w:tcPr>
+          <w:p>
+            <w:r>
+              <w:rPr>
+                <w:b/>
+                <w:bCs/>
+                <w:color w:val="FFFFFF"/>
+                <w:sz w:val="19"/>
+                <w:szCs w:val="19"/>
+              </w:rPr>
+              <w:t xml:space="preserve">ProHub</w:t>
+            </w:r>
+          </w:p>
+        </w:tc>
+        <w:tc>
+          <w:tcPr>
+            <w:tcW w:type="dxa" w:w="3008"/>
+            <w:shd w:fill="1c2b4a" w:val="clear"/>
+          </w:tcPr>
+          <w:p>
+            <w:r>
+              <w:rPr>
+                <w:b/>
+                <w:bCs/>
+                <w:color w:val="FFFFFF"/>
+                <w:sz w:val="19"/>
+                <w:szCs w:val="19"/>
+              </w:rPr>
+              <w:t xml:space="preserve">Agência Recria / Amanda</w:t>
+            </w:r>
+          </w:p>
+        </w:tc>
+      </w:tr>
+      <w:tr>
+        <w:tc>
+          <w:tcPr>
+            <w:tcW w:type="dxa" w:w="3008"/>
+          </w:tcPr>
+          <w:p>
+            <w:r>
+              <w:rPr>
+                <w:b w:val="false"/>
+                <w:bCs w:val="false"/>
+                <w:color w:val="000000"/>
+                <w:sz w:val="19"/>
+                <w:szCs w:val="19"/>
+              </w:rPr>
+              <w:t xml:space="preserve">O que cobre</w:t>
+            </w:r>
+          </w:p>
+        </w:tc>
+        <w:tc>
+          <w:tcPr>
+            <w:tcW w:type="dxa" w:w="3008"/>
+          </w:tcPr>
+          <w:p>
+            <w:r>
+              <w:rPr>
+                <w:b w:val="false"/>
+                <w:bCs w:val="false"/>
+                <w:color w:val="000000"/>
+                <w:sz w:val="19"/>
+                <w:szCs w:val="19"/>
+              </w:rPr>
+              <w:t xml:space="preserve">Só os cortes avulsos de um episódio, sob demanda</w:t>
+            </w:r>
+          </w:p>
+        </w:tc>
+        <w:tc>
+          <w:tcPr>
+            <w:tcW w:type="dxa" w:w="3008"/>
+          </w:tcPr>
+          <w:p>
+            <w:r>
+              <w:rPr>
+                <w:b w:val="false"/>
+                <w:bCs w:val="false"/>
+                <w:color w:val="000000"/>
+                <w:sz w:val="19"/>
+                <w:szCs w:val="19"/>
+              </w:rPr>
+              <w:t xml:space="preserve">Cortes de episódio, cortes de live e edição de outros materiais, todo mês</w:t>
+            </w:r>
+          </w:p>
+        </w:tc>
+      </w:tr>
+      <w:tr>
+        <w:tc>
+          <w:tcPr>
+            <w:tcW w:type="dxa" w:w="3008"/>
+          </w:tcPr>
+          <w:p>
+            <w:r>
+              <w:rPr>
+                <w:b w:val="false"/>
+                <w:bCs w:val="false"/>
+                <w:color w:val="000000"/>
+                <w:sz w:val="19"/>
+                <w:szCs w:val="19"/>
+              </w:rPr>
+              <w:t xml:space="preserve">Valor por episódio (até 30 cortes)</w:t>
+            </w:r>
+          </w:p>
+        </w:tc>
+        <w:tc>
+          <w:tcPr>
+            <w:tcW w:type="dxa" w:w="3008"/>
+          </w:tcPr>
+          <w:p>
+            <w:r>
+              <w:rPr>
+                <w:b w:val="false"/>
+                <w:bCs w:val="false"/>
+                <w:color w:val="000000"/>
+                <w:sz w:val="19"/>
+                <w:szCs w:val="19"/>
+              </w:rPr>
+              <w:t xml:space="preserve">R$ 2.400,00 avulso</w:t>
+            </w:r>
+          </w:p>
+        </w:tc>
+        <w:tc>
+          <w:tcPr>
+            <w:tcW w:type="dxa" w:w="3008"/>
+          </w:tcPr>
+          <w:p>
+            <w:r>
+              <w:rPr>
+                <w:b w:val="false"/>
+                <w:bCs w:val="false"/>
+                <w:color w:val="000000"/>
+                <w:sz w:val="19"/>
+                <w:szCs w:val="19"/>
+              </w:rPr>
+              <w:t xml:space="preserve">Dentro do mensal — equivalente a R$ 1.500,00 no mês em que entrega um episódio</w:t>
+            </w:r>
+          </w:p>
+        </w:tc>
+      </w:tr>
+      <w:tr>
+        <w:tc>
+          <w:tcPr>
+            <w:tcW w:type="dxa" w:w="3008"/>
+          </w:tcPr>
+          <w:p>
+            <w:r>
+              <w:rPr>
+                <w:b w:val="false"/>
+                <w:bCs w:val="false"/>
+                <w:color w:val="000000"/>
+                <w:sz w:val="19"/>
+                <w:szCs w:val="19"/>
+              </w:rPr>
+              <w:t xml:space="preserve">Nos meses sem episódio novo</w:t>
+            </w:r>
+          </w:p>
+        </w:tc>
+        <w:tc>
+          <w:tcPr>
+            <w:tcW w:type="dxa" w:w="3008"/>
+          </w:tcPr>
+          <w:p>
+            <w:r>
+              <w:rPr>
+                <w:b w:val="false"/>
+                <w:bCs w:val="false"/>
+                <w:color w:val="000000"/>
+                <w:sz w:val="19"/>
+                <w:szCs w:val="19"/>
+              </w:rPr>
+              <w:t xml:space="preserve">Não cobre nada, contrato fica parado</w:t>
+            </w:r>
+          </w:p>
+        </w:tc>
+        <w:tc>
+          <w:tcPr>
+            <w:tcW w:type="dxa" w:w="3008"/>
+          </w:tcPr>
+          <w:p>
+            <w:r>
+              <w:rPr>
+                <w:b w:val="false"/>
+                <w:bCs w:val="false"/>
+                <w:color w:val="000000"/>
+                <w:sz w:val="19"/>
+                <w:szCs w:val="19"/>
+              </w:rPr>
+              <w:t xml:space="preserve">Valor mensal continua ativo, cobrindo cortes de live/outros materiais</w:t>
+            </w:r>
+          </w:p>
+        </w:tc>
+      </w:tr>
+      <w:tr>
+        <w:tc>
+          <w:tcPr>
+            <w:tcW w:type="dxa" w:w="3008"/>
+          </w:tcPr>
+          <w:p>
+            <w:r>
+              <w:rPr>
+                <w:b w:val="false"/>
+                <w:bCs w:val="false"/>
+                <w:color w:val="000000"/>
+                <w:sz w:val="19"/>
+                <w:szCs w:val="19"/>
+              </w:rPr>
+              <w:t xml:space="preserve">Upload do episódio completo (YouTube)</w:t>
+            </w:r>
+          </w:p>
+        </w:tc>
+        <w:tc>
+          <w:tcPr>
+            <w:tcW w:type="dxa" w:w="3008"/>
+          </w:tcPr>
+          <w:p>
+            <w:r>
+              <w:rPr>
+                <w:b w:val="false"/>
+                <w:bCs w:val="false"/>
+                <w:color w:val="000000"/>
+                <w:sz w:val="19"/>
+                <w:szCs w:val="19"/>
+              </w:rPr>
+              <w:t xml:space="preserve">Não incluso</w:t>
+            </w:r>
+          </w:p>
+        </w:tc>
+        <w:tc>
+          <w:tcPr>
+            <w:tcW w:type="dxa" w:w="3008"/>
+          </w:tcPr>
+          <w:p>
+            <w:r>
+              <w:rPr>
+                <w:b w:val="false"/>
+                <w:bCs w:val="false"/>
+                <w:color w:val="000000"/>
+                <w:sz w:val="19"/>
+                <w:szCs w:val="19"/>
+              </w:rPr>
+              <w:t xml:space="preserve">Incluso</w:t>
+            </w:r>
+          </w:p>
+        </w:tc>
+      </w:tr>
+    </w:tbl>
+    <w:p>
+      <w:pPr>
+        <w:spacing w:after="160"/>
+      </w:pPr>
+    </w:p>
+    <w:p>
+      <w:pPr>
+        <w:spacing w:after="160"/>
+      </w:pPr>
+      <w:r>
+        <w:rPr>
+          <w:sz w:val="21"/>
+          <w:szCs w:val="21"/>
+        </w:rPr>
+        <w:t xml:space="preserve">Mesmo nos meses em que entrega os cortes de um episódio, o Giuliano já sai com um desconto de quase R$ 900,00 em relação ao que a ProHub cobraria pelo mesmo volume — e nos meses sem episódio novo, o valor mensal continua gerando entrega, em vez de ficar parado.</w:t>
       </w:r>
     </w:p>
     <w:p>

</xml_diff>

<commit_message>
Corrige grafia do nome Rene (sem acento)
Co-Authored-By: Claude Sonnet 5 <noreply@anthropic.com>
Claude-Session: https://claude.ai/code/session_01GQSqEjEuqv44iBdACeUWUZ
</commit_message>
<xml_diff>
--- a/eleva/proposta-cortes-elevacast-prohub.docx
+++ b/eleva/proposta-cortes-elevacast-prohub.docx
@@ -162,7 +162,7 @@
           <w:sz w:val="21"/>
           <w:szCs w:val="21"/>
         </w:rPr>
-        <w:t xml:space="preserve"> os cortes (e também do upload do episódio completo no YouTube e no Spotify) é a empresa do Alexandre (primo do Giuliano), na qual a Eleva é atendida pelo René. O problema: o René está entregando com muito atraso — mais de 30 dias, enquanto a ProHub entrega em até 15. É esse ponto que precisa de uma decisão agora.</w:t>
+        <w:t xml:space="preserve"> os cortes (e também do upload do episódio completo no YouTube e no Spotify) é a empresa do Alexandre (primo do Giuliano), na qual a Eleva é atendida pelo Rene. O problema: o Rene está entregando com muito atraso — mais de 30 dias, enquanto a ProHub entrega em até 15. É esse ponto que precisa de uma decisão agora.</w:t>
       </w:r>
     </w:p>
     <w:p>
@@ -567,7 +567,7 @@
           <w:sz w:val="21"/>
           <w:szCs w:val="21"/>
         </w:rPr>
-        <w:t xml:space="preserve"> a ProHub cuida só da gravação e da entrega do episódio bruto editado e sem cortes — o upload no YouTube e todos os cortes ficam por conta do René.</w:t>
+        <w:t xml:space="preserve"> a ProHub cuida só da gravação e da entrega do episódio bruto editado e sem cortes — o upload no YouTube e todos os cortes ficam por conta do Rene.</w:t>
       </w:r>
     </w:p>
     <w:p>

</xml_diff>

<commit_message>
Corrige cronograma: fevereiro é o mês sem episódio novo, não janeiro
Co-Authored-By: Claude Sonnet 5 <noreply@anthropic.com>
Claude-Session: https://claude.ai/code/session_01GQSqEjEuqv44iBdACeUWUZ
</commit_message>
<xml_diff>
--- a/eleva/proposta-cortes-elevacast-prohub.docx
+++ b/eleva/proposta-cortes-elevacast-prohub.docx
@@ -1225,7 +1225,7 @@
           <w:sz w:val="21"/>
           <w:szCs w:val="21"/>
         </w:rPr>
-        <w:t xml:space="preserve">Janeiro e fevereiro (meses sem episódio novo de podcast): Amanda usa o mesmo valor mensal para cortar as lives, ou editar outros materiais — vídeos extras que o Giuliano gravar em casa, por exemplo, ou apoiar na captação desses vídeos.</w:t>
+        <w:t xml:space="preserve">Fevereiro (mês sem episódio novo de podcast): Amanda usa o mesmo valor mensal para cortes das lives que ocorrerem no YouTube e no Instagram, editando materiais extras — vídeos que o Giuliano gravar em casa, por exemplo, ou apoio na captação desses vídeos, para anúncios e para o feed.</w:t>
       </w:r>
     </w:p>
     <w:p>
@@ -1243,6 +1243,18 @@
           <w:szCs w:val="21"/>
         </w:rPr>
         <w:t xml:space="preserve">Março: volta o ciclo com a próxima gravação de episódios.</w:t>
+      </w:r>
+    </w:p>
+    <w:p>
+      <w:pPr>
+        <w:spacing w:after="160"/>
+      </w:pPr>
+      <w:r>
+        <w:rPr>
+          <w:sz w:val="21"/>
+          <w:szCs w:val="21"/>
+        </w:rPr>
+        <w:t xml:space="preserve">Ou seja: dois meses a Amanda entrega edição de episódios, um mês edita materiais extras.</w:t>
       </w:r>
     </w:p>
     <w:p>

</xml_diff>

<commit_message>
Acrescenta terceira opção na decisão: manter como está, com o Rene
Co-Authored-By: Claude Sonnet 5 <noreply@anthropic.com>
Claude-Session: https://claude.ai/code/session_01GQSqEjEuqv44iBdACeUWUZ
</commit_message>
<xml_diff>
--- a/eleva/proposta-cortes-elevacast-prohub.docx
+++ b/eleva/proposta-cortes-elevacast-prohub.docx
@@ -1338,7 +1338,40 @@
           <w:sz w:val="21"/>
           <w:szCs w:val="21"/>
         </w:rPr>
-        <w:t xml:space="preserve">, com acréscimo mensal de R$ 1.500,00 no contrato da RECRIA a serem pagos a partir de dezembro de 2026.</w:t>
+        <w:t xml:space="preserve">, com acréscimo mensal de R$ 1.500,00 no contrato da RECRIA a serem pagos a partir de dezembro de 2026, ou</w:t>
+      </w:r>
+    </w:p>
+    <w:p>
+      <w:pPr>
+        <w:pStyle w:val="ListParagraph"/>
+        <w:numPr>
+          <w:ilvl w:val="0"/>
+          <w:numId w:val="2"/>
+        </w:numPr>
+        <w:spacing w:after="80"/>
+      </w:pPr>
+      <w:r>
+        <w:rPr>
+          <w:sz w:val="21"/>
+          <w:szCs w:val="21"/>
+        </w:rPr>
+        <w:t xml:space="preserve">3. Deixar como está, com o </w:t>
+      </w:r>
+      <w:r>
+        <w:rPr>
+          <w:b/>
+          <w:bCs/>
+          <w:sz w:val="21"/>
+          <w:szCs w:val="21"/>
+        </w:rPr>
+        <w:t xml:space="preserve">Rene</w:t>
+      </w:r>
+      <w:r>
+        <w:rPr>
+          <w:sz w:val="21"/>
+          <w:szCs w:val="21"/>
+        </w:rPr>
+        <w:t xml:space="preserve">.</w:t>
       </w:r>
     </w:p>
     <w:sectPr>

</xml_diff>